<commit_message>
Sync generated output files
</commit_message>
<xml_diff>
--- a/output/flowserve_us_raleigh_nc_us_july_2026_report.docx
+++ b/output/flowserve_us_raleigh_nc_us_july_2026_report.docx
@@ -351,7 +351,7 @@
               <w:rPr>
                 <w:sz w:val="18"/>
               </w:rPr>
-              <w:t>05 August 2026</w:t>
+              <w:t>20 August 2026</w:t>
             </w:r>
           </w:p>
         </w:tc>
@@ -439,7 +439,7 @@
           <w:color w:val="00857C"/>
           <w:sz w:val="20"/>
         </w:rPr>
-        <w:t>Good</w:t>
+        <w:t>Excellent</w:t>
       </w:r>
     </w:p>
     <w:p>
@@ -453,7 +453,7 @@
           <w:i w:val="0"/>
           <w:sz w:val="20"/>
         </w:rPr>
-        <w:t>The average mild steel corrosion rate was 1.10 MPY against the target of within 3.0 MPY, and the average copper corrosion rate was 0.0250 MPY against the target of within 0.5 MPY. Both corrosion indicators were maintained within the required control targets for the July reporting period, supporting good asset preservation for the cooling water system.</w:t>
+        <w:t>The average mild steel corrosion rate was 1.10 MPY against the target of within 3.0 MPY, and the average copper corrosion rate was 0.0250 MPY against the target of within 0.5 MPY. Both corrosion indicators were maintained within the required control targets for the July reporting period, supporting excellent asset preservation for the cooling water system.</w:t>
       </w:r>
     </w:p>
     <w:p>
@@ -486,7 +486,7 @@
           <w:color w:val="B8860B"/>
           <w:sz w:val="20"/>
         </w:rPr>
-        <w:t>Stable</w:t>
+        <w:t>Acceptable</w:t>
       </w:r>
     </w:p>
     <w:p>
@@ -500,7 +500,7 @@
           <w:i w:val="0"/>
           <w:sz w:val="20"/>
         </w:rPr>
-        <w:t>Traced Product averaged 91.9 ppm against the SCC target range of 82.0-88.0 ppm, with 41.3% of July readings maintained within range. Observation: Traced Product was above the programmed control band for much of the month, indicating scale control needs attention even though part of the month was within range. Conductivity was below its SCC range for most of the same period, which points to water balance or dilution conditions as a likely contributor rather than a simple overfeed condition alone. Recommendation: verify fluorometer calibration, review product feed settings, check pump rate, and inspect water balance and blowdown/makeup behavior during the upcoming service visit.</w:t>
+        <w:t>Traced Product was within the Controller Setpoint control range for 41.3% of the reporting month. Polymer consumption rate averaged 64.3% and decreased from 64.6% at the start of the month to 64.3% at the end of the month. The product was higher than target during the initial part of the month and moved closer to the control band later, but end-of-month control was 52.4% within range, so it is not yet consistently maintained well. The end-of-month traced product deviation from setpoint is minimal, so the control logic will be optimised. Conductivity was below its setpoint configuration range for most of the same period, so water loss, dilution, or blowdown/makeup behavior should be inspected during the upcoming service visit.</w:t>
       </w:r>
     </w:p>
     <w:p>
@@ -533,7 +533,7 @@
           <w:color w:val="B8860B"/>
           <w:sz w:val="20"/>
         </w:rPr>
-        <w:t>Stable</w:t>
+        <w:t>Acceptable</w:t>
       </w:r>
     </w:p>
     <w:p>
@@ -547,7 +547,21 @@
           <w:i w:val="0"/>
           <w:sz w:val="20"/>
         </w:rPr>
-        <w:t>FRC data was not available in the MDE data for this reporting period and will be checked during the upcoming service visit. ORP spike response after biocide feed was consistent, indicating the system responded to treatment; microbial control should continue to be reviewed once field FRC confirmation is available.</w:t>
+        <w:t>FRC data was not available in the MDE data for this reporting period and will be checked during the upcoming service visit. ORP spike response after biocide feed was consistent, indicating the slug dosage of biocide is successful.</w:t>
+      </w:r>
+    </w:p>
+    <w:p>
+      <w:pPr>
+        <w:spacing w:before="80" w:after="120"/>
+        <w:jc w:val="left"/>
+      </w:pPr>
+      <w:r>
+        <w:rPr>
+          <w:b w:val="0"/>
+          <w:i w:val="0"/>
+          <w:sz w:val="20"/>
+        </w:rPr>
+        <w:t>Dip-slide analysis was not available for this reporting period and will be measured during the upcoming service visit.</w:t>
       </w:r>
     </w:p>
     <w:p>
@@ -602,6 +616,26 @@
           <w:sz w:val="26"/>
         </w:rPr>
         <w:t>Product Efficiency</w:t>
+      </w:r>
+    </w:p>
+    <w:p>
+      <w:pPr>
+        <w:spacing w:before="60" w:after="100"/>
+      </w:pPr>
+      <w:r>
+        <w:rPr>
+          <w:b/>
+          <w:sz w:val="20"/>
+        </w:rPr>
+        <w:t xml:space="preserve">Status: </w:t>
+      </w:r>
+      <w:r>
+        <w:rPr>
+          <w:b/>
+          <w:color w:val="B8860B"/>
+          <w:sz w:val="20"/>
+        </w:rPr>
+        <w:t>Acceptable</w:t>
       </w:r>
     </w:p>
     <w:p>
@@ -1058,7 +1092,7 @@
               <w:rPr>
                 <w:sz w:val="18"/>
               </w:rPr>
-              <w:t>✓ Good</w:t>
+              <w:t>✓ Excellent</w:t>
             </w:r>
           </w:p>
         </w:tc>
@@ -1230,7 +1264,7 @@
               <w:rPr>
                 <w:sz w:val="18"/>
               </w:rPr>
-              <w:t>✓ Good</w:t>
+              <w:t>✓ Excellent</w:t>
             </w:r>
           </w:p>
         </w:tc>
@@ -1402,7 +1436,7 @@
               <w:rPr>
                 <w:sz w:val="18"/>
               </w:rPr>
-              <w:t>⚠ Stable</w:t>
+              <w:t>⚠ Acceptable</w:t>
             </w:r>
           </w:p>
         </w:tc>
@@ -1574,7 +1608,7 @@
               <w:rPr>
                 <w:sz w:val="18"/>
               </w:rPr>
-              <w:t>⚠ Action Required</w:t>
+              <w:t>✗ Critical</w:t>
             </w:r>
           </w:p>
         </w:tc>
@@ -2534,11 +2568,53 @@
       </w:pPr>
       <w:r>
         <w:rPr>
+          <w:b/>
           <w:i/>
           <w:color w:val="333333"/>
           <w:sz w:val="19"/>
         </w:rPr>
-        <w:t>Comment: The corrosion trend remained controlled overall, with recent mild steel and copper readings staying comfortably within the required limits.</w:t>
+        <w:t xml:space="preserve">Comment: </w:t>
+      </w:r>
+      <w:r>
+        <w:rPr>
+          <w:i/>
+          <w:color w:val="333333"/>
+          <w:sz w:val="19"/>
+        </w:rPr>
+        <w:t>Pattern: corrosion control is decreasing, but remains good against the target.</w:t>
+      </w:r>
+      <w:r>
+        <w:br/>
+      </w:r>
+      <w:r>
+        <w:rPr>
+          <w:i/>
+          <w:color w:val="333333"/>
+          <w:sz w:val="19"/>
+        </w:rPr>
+        <w:t>Mild steel corrosion decreased across the month, while copper corrosion decreased across the month.</w:t>
+      </w:r>
+      <w:r>
+        <w:br/>
+      </w:r>
+      <w:r>
+        <w:rPr>
+          <w:i/>
+          <w:color w:val="333333"/>
+          <w:sz w:val="19"/>
+        </w:rPr>
+        <w:t>MS was within the 3.0 MPY target, and Cu was within the 0.5 MPY target.</w:t>
+      </w:r>
+      <w:r>
+        <w:br/>
+      </w:r>
+      <w:r>
+        <w:rPr>
+          <w:i/>
+          <w:color w:val="333333"/>
+          <w:sz w:val="19"/>
+        </w:rPr>
+        <w:t>This graph means corrosion protection remains acceptable when both traces stay below target limits.</w:t>
       </w:r>
     </w:p>
     <w:p>
@@ -2613,11 +2689,53 @@
       </w:pPr>
       <w:r>
         <w:rPr>
+          <w:b/>
           <w:i/>
           <w:color w:val="333333"/>
           <w:sz w:val="19"/>
         </w:rPr>
-        <w:t>Comment: The Traced Product trend spent part of July within range but remained above the SCC control band often enough to require continued review.</w:t>
+        <w:t xml:space="preserve">Comment: </w:t>
+      </w:r>
+      <w:r>
+        <w:rPr>
+          <w:i/>
+          <w:color w:val="333333"/>
+          <w:sz w:val="19"/>
+        </w:rPr>
+        <w:t>Pattern: Traced Product is decreasing and needs attention against the target.</w:t>
+      </w:r>
+      <w:r>
+        <w:br/>
+      </w:r>
+      <w:r>
+        <w:rPr>
+          <w:i/>
+          <w:color w:val="333333"/>
+          <w:sz w:val="19"/>
+        </w:rPr>
+        <w:t>The trend moved from about 92.9 ppm at the start to 90.9 ppm at the end.</w:t>
+      </w:r>
+      <w:r>
+        <w:br/>
+      </w:r>
+      <w:r>
+        <w:rPr>
+          <w:i/>
+          <w:color w:val="333333"/>
+          <w:sz w:val="19"/>
+        </w:rPr>
+        <w:t>The Traced Product average was above the configured range. The monthly in-range performance was 41.3%.</w:t>
+      </w:r>
+      <w:r>
+        <w:br/>
+      </w:r>
+      <w:r>
+        <w:rPr>
+          <w:i/>
+          <w:color w:val="333333"/>
+          <w:sz w:val="19"/>
+        </w:rPr>
+        <w:t>This graph shows whether feed control is holding the setpoint band or drifting toward field review.</w:t>
       </w:r>
     </w:p>
     <w:p>
@@ -2692,11 +2810,53 @@
       </w:pPr>
       <w:r>
         <w:rPr>
+          <w:b/>
           <w:i/>
           <w:color w:val="333333"/>
           <w:sz w:val="19"/>
         </w:rPr>
-        <w:t>Comment: The ORP response showed treatment activity without requiring absolute ORP values to be reported in the narrative.</w:t>
+        <w:t xml:space="preserve">Comment: </w:t>
+      </w:r>
+      <w:r>
+        <w:rPr>
+          <w:i/>
+          <w:color w:val="333333"/>
+          <w:sz w:val="19"/>
+        </w:rPr>
+        <w:t>Pattern: ORP response is increasing across the month.</w:t>
+      </w:r>
+      <w:r>
+        <w:br/>
+      </w:r>
+      <w:r>
+        <w:rPr>
+          <w:i/>
+          <w:color w:val="333333"/>
+          <w:sz w:val="19"/>
+        </w:rPr>
+        <w:t>ORP showed a visible spike response pattern during the month without relying on absolute ORP values.</w:t>
+      </w:r>
+      <w:r>
+        <w:br/>
+      </w:r>
+      <w:r>
+        <w:rPr>
+          <w:i/>
+          <w:color w:val="333333"/>
+          <w:sz w:val="19"/>
+        </w:rPr>
+        <w:t>Copper corrosion decreased across the month while the ORP pattern changed.</w:t>
+      </w:r>
+      <w:r>
+        <w:br/>
+      </w:r>
+      <w:r>
+        <w:rPr>
+          <w:i/>
+          <w:color w:val="333333"/>
+          <w:sz w:val="19"/>
+        </w:rPr>
+        <w:t>This graph remains good when biocide response is visible and copper corrosion stays controlled.</w:t>
       </w:r>
     </w:p>
     <w:p>
@@ -2763,6 +2923,61 @@
           <w:sz w:val="17"/>
         </w:rPr>
         <w:t>Figure 4: Oxidizing Biocide Pump Relay vs Copper Corrosion — July 2026</w:t>
+      </w:r>
+    </w:p>
+    <w:p>
+      <w:pPr>
+        <w:spacing w:before="40" w:after="200"/>
+      </w:pPr>
+      <w:r>
+        <w:rPr>
+          <w:b/>
+          <w:i/>
+          <w:color w:val="333333"/>
+          <w:sz w:val="19"/>
+        </w:rPr>
+        <w:t xml:space="preserve">Comment: </w:t>
+      </w:r>
+      <w:r>
+        <w:rPr>
+          <w:i/>
+          <w:color w:val="333333"/>
+          <w:sz w:val="19"/>
+        </w:rPr>
+        <w:t>Pattern: biocide feed versus copper corrosion is decreasing, but remains good against the target.</w:t>
+      </w:r>
+      <w:r>
+        <w:br/>
+      </w:r>
+      <w:r>
+        <w:rPr>
+          <w:i/>
+          <w:color w:val="333333"/>
+          <w:sz w:val="19"/>
+        </w:rPr>
+        <w:t>Biocide relay activity was present in the monthly trend.</w:t>
+      </w:r>
+      <w:r>
+        <w:br/>
+      </w:r>
+      <w:r>
+        <w:rPr>
+          <w:i/>
+          <w:color w:val="333333"/>
+          <w:sz w:val="19"/>
+        </w:rPr>
+        <w:t>Relay activity increased across the month when the month is split into early and late periods.</w:t>
+      </w:r>
+      <w:r>
+        <w:br/>
+      </w:r>
+      <w:r>
+        <w:rPr>
+          <w:i/>
+          <w:color w:val="333333"/>
+          <w:sz w:val="19"/>
+        </w:rPr>
+        <w:t>This graph shows whether feed timing is supporting stable corrosion control during biocide operation.</w:t>
       </w:r>
     </w:p>
     <w:p>
@@ -2837,11 +3052,53 @@
       </w:pPr>
       <w:r>
         <w:rPr>
+          <w:b/>
           <w:i/>
           <w:color w:val="333333"/>
           <w:sz w:val="19"/>
         </w:rPr>
-        <w:t>Comment: The conductivity trend was below the SCC range for much of the recent period but moved closer to the control band near the end of the month.</w:t>
+        <w:t xml:space="preserve">Comment: </w:t>
+      </w:r>
+      <w:r>
+        <w:rPr>
+          <w:i/>
+          <w:color w:val="333333"/>
+          <w:sz w:val="19"/>
+        </w:rPr>
+        <w:t>Pattern: conductivity is decreasing and needs attention against the target.</w:t>
+      </w:r>
+      <w:r>
+        <w:br/>
+      </w:r>
+      <w:r>
+        <w:rPr>
+          <w:i/>
+          <w:color w:val="333333"/>
+          <w:sz w:val="19"/>
+        </w:rPr>
+        <w:t>The trend moved from about 896.8 µS/cm at the start to 884.5 µS/cm at the end.</w:t>
+      </w:r>
+      <w:r>
+        <w:br/>
+      </w:r>
+      <w:r>
+        <w:rPr>
+          <w:i/>
+          <w:color w:val="333333"/>
+          <w:sz w:val="19"/>
+        </w:rPr>
+        <w:t>The conductivity average was below the configured range. The monthly in-range performance was 20.2%.</w:t>
+      </w:r>
+      <w:r>
+        <w:br/>
+      </w:r>
+      <w:r>
+        <w:rPr>
+          <w:i/>
+          <w:color w:val="333333"/>
+          <w:sz w:val="19"/>
+        </w:rPr>
+        <w:t>This graph shows whether cycles, makeup, blowdown, or dilution behavior remained under control.</w:t>
       </w:r>
     </w:p>
     <w:p>

</xml_diff>